<commit_message>
Anexo cerradora en version de firma: puertas nuevas (12 en 12 dias de campaña / 20 al 5-oct, bono al 5-oct), pauta financiada y ejecutada por la casa hacia linea de la academia operada por ella, portafolio completo, rebose 4h, pase cruzado 1 pct, piezas propias no se remuneran por pieza; sin avisos de borrador
Co-Authored-By: Claude Fable 5 <noreply@anthropic.com>
Claude-Session: https://claude.ai/code/session_01L7UVFxHQqF8Q2935VhdxJh
</commit_message>
<xml_diff>
--- a/contratos/ANEXO_ECONOMICO_CERRADORA_v1.docx
+++ b/contratos/ANEXO_ECONOMICO_CERRADORA_v1.docx
@@ -24,7 +24,7 @@
           <w:color w:val="777777"/>
           <w:sz w:val="19"/>
         </w:rPr>
-        <w:t>BORRADOR 14/09/2026 — PENDIENTE: visto bueno del abogado y confirmación del esquema de pauta con el equipo de la casa · Hace parte integral del Contrato de Prestación de Servicios Comerciales suscrito entre las partes</w:t>
+        <w:t>Hace parte integral del Contrato de Prestación de Servicios Comerciales suscrito entre las partes · Septiembre 2026</w:t>
       </w:r>
     </w:p>
     <w:p/>
@@ -57,7 +57,7 @@
           <w:b/>
           <w:sz w:val="21"/>
         </w:rPr>
-        <w:t>CANAL PROPIO — 8%: comisión del OCHO por ciento (8%) del recaudo efectivo a caja por toda venta originada en el canal propio del (de la) CONTRATISTA: su contenido, su red personal y las campañas de pauta que la institución financie sobre sus piezas. La pauta la ejecuta la institución desde sus cuentas publicitarias, sobre piezas del (de la) CONTRATISTA aprobadas por gerencia, dirigiendo los leads al canal del (de la) CONTRATISTA; esos leads son canal propio.</w:t>
+        <w:t>CANAL PROPIO — 8%: comisión del OCHO por ciento (8%) del recaudo efectivo a caja por toda venta originada en el canal propio del (de la) CONTRATISTA: su contenido, su red personal y las campañas de pauta que la institución financie sobre sus piezas. La pauta la financia y la ejecuta la institución desde sus cuentas publicitarias, sobre piezas del (de la) CONTRATISTA aprobadas por gerencia antes de publicar, dirigiendo los leads a la línea de WhatsApp Business de la institución operada por el (la) CONTRATISTA; esos leads son canal propio. Aplica a todo el portafolio (Arranque, programas completos, niveles individuales y sabatinos).</w:t>
       </w:r>
     </w:p>
     <w:p>
@@ -77,7 +77,7 @@
           <w:b/>
           <w:sz w:val="21"/>
         </w:rPr>
-        <w:t>ACELERADOR — 10% RETROACTIVO: la comisión sube al DIEZ por ciento (10%) sobre la TOTALIDAD de la serie de ventas del (de la) CONTRATISTA en esta campaña si se cumple cualquiera de las dos metas: (a) al 30 DE SEPTIEMBRE de 2026, ambas jornadas abiertas con dieciséis (16) matrículas en total, mínimo ocho (8) por jornada; o (b) los veinte (20) cupos de lanzamiento vendidos antes del 5 DE OCTUBRE de 2026. No cumplida ninguna, aplica el 8%.</w:t>
+        <w:t>ACELERADOR — 10% RETROACTIVO: la comisión sube al DIEZ por ciento (10%) sobre la TOTALIDAD de la serie de ventas del (de la) CONTRATISTA en esta campaña si se cumple cualquiera de las dos metas: (a) DOCE (12) matrículas de la cohorte del 5 de octubre dentro de los primeros DOCE (12) DÍAS de campaña al aire (el día 1 es la fecha de publicación de la primera campaña, registrada en la planilla); o (b) los veinte (20) cupos de lanzamiento vendidos antes del 5 DE OCTUBRE de 2026. No cumplida ninguna, aplica el 8%. Las metas cuentan solo matrículas de la cohorte del 5 de octubre.</w:t>
       </w:r>
     </w:p>
     <w:p>
@@ -97,7 +97,7 @@
           <w:b w:val="0"/>
           <w:sz w:val="21"/>
         </w:rPr>
-        <w:t>BONO GRUPOS LLENOS: veintiocho (28) matrículas (14 y 14 por jornada) al 30 de septiembre de 2026 = bono único de DOS MILLONES DE PESOS ($2.000.000), adicional al acelerador.</w:t>
+        <w:t>BONO GRUPOS LLENOS: veintiocho (28) matrículas (14 y 14 por jornada) antes del 5 DE OCTUBRE de 2026 = bono único de DOS MILLONES DE PESOS ($2.000.000), adicional al acelerador.</w:t>
       </w:r>
     </w:p>
     <w:p>
@@ -117,7 +117,7 @@
           <w:b w:val="0"/>
           <w:sz w:val="21"/>
         </w:rPr>
-        <w:t>LEADS ENTREGADOS POR LA INSTITUCIÓN: 5% del recaudo de cliente nuevo y 2,5% de cliente antiguo, solo sobre leads asignados expresamente en planilla.</w:t>
+        <w:t>LEADS ENTREGADOS POR LA INSTITUCIÓN: 5% del recaudo de cliente nuevo y 2,5% de cliente antiguo, solo sobre leads asignados expresamente en planilla. REBOSE: el lead asignado sin gestión registrada en planilla dentro de las cuatro (4) horas siguientes (ventana 8:00 AM - 9:00 PM) vuelve a la institución para reasignación. PASE CRUZADO: quien pase un cliente registrado a otro miembro del equipo recibe el UNO por ciento (1%) del recaudo si este lo cierra — en ambas direcciones, siempre con el pase anotado en planilla.</w:t>
       </w:r>
     </w:p>
     <w:p>
@@ -137,7 +137,7 @@
           <w:b w:val="0"/>
           <w:sz w:val="21"/>
         </w:rPr>
-        <w:t>PAUTA: presupuesto inicial de hasta UN MILLÓN DE PESOS ($1.000.000) mensuales, aprobado pieza a pieza por gerencia, revisable por resultados. El gasto de pauta lo asume la institución y no se descuenta de las comisiones.</w:t>
+        <w:t>PAUTA: presupuesto inicial de hasta UN MILLÓN DE PESOS ($1.000.000) mensuales para la campaña del (de la) CONTRATISTA, aprobado pieza a pieza por gerencia y ajustable según el costo por matrícula de cada campaña. El gasto de pauta lo asume la institución y no se descuenta de las comisiones. Las piezas que el (la) CONTRATISTA grabe para su propia campaña no se remuneran por pieza: su retribución es la comisión de este anexo.</w:t>
       </w:r>
     </w:p>
     <w:p>

</xml_diff>